<commit_message>
Added bug fixes on debug prompt and keeping chat window persistent
</commit_message>
<xml_diff>
--- a/Productivity-App/Brain_Assistant_Development_Guide.docx
+++ b/Productivity-App/Brain_Assistant_Development_Guide.docx
@@ -2333,7 +2333,7 @@
         <w:pStyle w:val="Normal"/>
       </w:pPr>
       <w:r>
-        <w:t xml:space="preserve">The Orchestrator now checks action clauses across the full current message, including later sentences and clauses after words such as then. Clear task actions such as asking someone for a deliverable, booking an appointment reminder, analysing material, or preparing work are sent to Task Agent even when the prompt also mentions a client meeting.</w:t>
+        <w:t xml:space="preserve">The Orchestrator now checks action clauses across the full current message, including later sentences and clauses after words such as then. Clear task actions such as asking someone for a deliverable, booking a dentist appointment, analysing material, or preparing work are sent to Task Agent even when the prompt also mentions a client meeting.</w:t>
       </w:r>
     </w:p>
     <w:p>
@@ -2366,6 +2366,14 @@
       </w:pPr>
       <w:r>
         <w:t xml:space="preserve">The planner creates one task per distinct outcome. Related actions can share one task when they form a single outcome, such as analysing material and using that analysis to prepare for a named meeting. If a later task depends on an earlier deliverable, both tasks remain in the proposal and the dependency can be recorded.</w:t>
+      </w:r>
+    </w:p>
+    <w:p>
+      <w:pPr>
+        <w:pStyle w:val="Normal"/>
+      </w:pPr>
+      <w:r>
+        <w:t xml:space="preserve">The editable task rules are in skills/task-planning/SKILL.md. The task planner loads these instructions without browser caching whenever it plans a request, so skill edits take effect on the next task-planning call.</w:t>
       </w:r>
     </w:p>
     <w:p>

</xml_diff>